<commit_message>
Card JJ.12 run: every sum to contact is ordered against the participants (the sum of tau^-1 is RE.2's -0.861 exactly); the past accumulator goes the human way but does not beat the instantaneous looming rule
Co-Authored-By: Claude Fable 5.1 <noreply@anthropic.com>
</commit_message>
<xml_diff>
--- a/docs/looming_as_free_energy.docx
+++ b/docs/looming_as_free_energy.docx
@@ -1596,6 +1596,134 @@
       </w:r>
       <w:r>
         <w:t xml:space="preserve">and only B’s parameters mean anything on this design. §4’s mapping stands as the reading to carry.</w:t>
+      </w:r>
+    </w:p>
+    <w:p>
+      <w:pPr>
+        <w:pStyle w:val="BodyText"/>
+      </w:pPr>
+      <w:r>
+        <w:rPr>
+          <w:b/>
+          <w:bCs/>
+        </w:rPr>
+        <w:t xml:space="preserve">2026-09-23, the future and the past (card JJ.12,</w:t>
+      </w:r>
+      <w:r>
+        <w:rPr>
+          <w:b/>
+          <w:bCs/>
+        </w:rPr>
+        <w:t xml:space="preserve"> </w:t>
+      </w:r>
+      <w:r>
+        <w:rPr>
+          <w:rStyle w:val="VerbatimChar"/>
+          <w:b/>
+          <w:bCs/>
+        </w:rPr>
+        <w:t xml:space="preserve">out/jj12_sums_future_past.md</w:t>
+      </w:r>
+      <w:r>
+        <w:rPr>
+          <w:b/>
+          <w:bCs/>
+        </w:rPr>
+        <w:t xml:space="preserve">).</w:t>
+      </w:r>
+      <w:r>
+        <w:t xml:space="preserve"> </w:t>
+      </w:r>
+      <w:r>
+        <w:t xml:space="preserve">Jonas asked</w:t>
+      </w:r>
+      <w:r>
+        <w:t xml:space="preserve"> </w:t>
+      </w:r>
+      <w:r>
+        <w:t xml:space="preserve">whether inverse tau, with its blow-up near contact, would flip the horizon sum. In closed form and</w:t>
+      </w:r>
+      <w:r>
+        <w:t xml:space="preserve"> </w:t>
+      </w:r>
+      <w:r>
+        <w:t xml:space="preserve">on the cells: no. The sum to contact of τ⁻¹, of its square, of θ̇ and of θ̇² are all ordered</w:t>
+      </w:r>
+      <w:r>
+        <w:t xml:space="preserve"> </w:t>
+      </w:r>
+      <w:r>
+        <w:t xml:space="preserve">against the participants (0 of 24 matched-TTC rows; ρ(gap) +0.84 to +1.00), and the sum of τ⁻¹</w:t>
+      </w:r>
+      <w:r>
+        <w:t xml:space="preserve"> </w:t>
+      </w:r>
+      <w:r>
+        <w:t xml:space="preserve">correlates −0.861 with the share, which is card RE.2’s</w:t>
+      </w:r>
+      <w:r>
+        <w:t xml:space="preserve"> </w:t>
+      </w:r>
+      <w:r>
+        <w:t xml:space="preserve">“inversion”</w:t>
+      </w:r>
+      <w:r>
+        <w:t xml:space="preserve"> </w:t>
+      </w:r>
+      <w:r>
+        <w:t xml:space="preserve">to three decimals. Steeper</w:t>
+      </w:r>
+      <w:r>
+        <w:t xml:space="preserve"> </w:t>
+      </w:r>
+      <w:r>
+        <w:t xml:space="preserve">costs make the sum proportional to the closing speed, which within a row is backwards. A sum over</w:t>
+      </w:r>
+      <w:r>
+        <w:t xml:space="preserve"> </w:t>
+      </w:r>
+      <w:r>
+        <w:t xml:space="preserve">the</w:t>
+      </w:r>
+      <w:r>
+        <w:t xml:space="preserve"> </w:t>
+      </w:r>
+      <w:r>
+        <w:rPr>
+          <w:b/>
+          <w:bCs/>
+        </w:rPr>
+        <w:t xml:space="preserve">past</w:t>
+      </w:r>
+      <w:r>
+        <w:t xml:space="preserve"> </w:t>
+      </w:r>
+      <w:r>
+        <w:t xml:space="preserve">(the Farewell accumulator) is a different object and goes the human way, 24 of 24</w:t>
+      </w:r>
+      <w:r>
+        <w:t xml:space="preserve"> </w:t>
+      </w:r>
+      <w:r>
+        <w:t xml:space="preserve">rows: over the shown clip 0.1332, since the onset 0.1283 with a free step gate (pre-onset 0.0271),</w:t>
+      </w:r>
+      <w:r>
+        <w:t xml:space="preserve"> </w:t>
+      </w:r>
+      <w:r>
+        <w:t xml:space="preserve">against the instantaneous looming rate’s 0.1130. So reading A stays rejected for the future sum,</w:t>
+      </w:r>
+      <w:r>
+        <w:t xml:space="preserve"> </w:t>
+      </w:r>
+      <w:r>
+        <w:t xml:space="preserve">and an accumulator reading, F integrated over the past, is the one construction left that could</w:t>
+      </w:r>
+      <w:r>
+        <w:t xml:space="preserve"> </w:t>
+      </w:r>
+      <w:r>
+        <w:t xml:space="preserve">beat the instantaneous threshold on this design (query JJ12.Q1).</w:t>
       </w:r>
     </w:p>
     <w:bookmarkEnd w:id="14"/>

</xml_diff>